<commit_message>
Susun ulang aplikasi ke paket berkas/ dan tambah fitur baru
- Pindahkan modul dari akar ke paket berkas/ (dokumen, perkakas, rute)
- Tambah pradaftar, kelengkapan, hak pakai, izin, sesi, dan referensi
- Dukungan PostgreSQL lewat setelan .env (contoh di .env.contoh)
- Templat baru: bap-hp, risalah-hp, sk-hp, checklist, pengembalian
- Tambah rangkaian uji di uji/ dan wsgi.py untuk produksi
- Lengkapi .gitignore: data pribadi, keluaran, rahasia, berkas sementara

Co-Authored-By: Claude Opus 5.5 <noreply@anthropic.com>
</commit_message>
<xml_diff>
--- a/templates/bap-wakaf.docx
+++ b/templates/bap-wakaf.docx
@@ -631,47 +631,7 @@
                 <w:sz w:val="20"/>
                 <w:szCs w:val="20"/>
               </w:rPr>
-              <w:t>{{*</w:t>
-            </w:r>
-            <w:proofErr w:type="spellStart"/>
-            <w:r>
-              <w:rPr>
-                <w:rFonts w:ascii="Arial" w:hAnsi="Arial" w:cs="Arial"/>
-                <w:color w:val="000000"/>
-                <w:sz w:val="20"/>
-                <w:szCs w:val="20"/>
-              </w:rPr>
-              <w:t>panitia</w:t>
-            </w:r>
-            <w:proofErr w:type="spellEnd"/>
-            <w:r>
-              <w:rPr>
-                <w:rFonts w:ascii="Arial" w:hAnsi="Arial" w:cs="Arial"/>
-                <w:color w:val="000000"/>
-                <w:sz w:val="20"/>
-                <w:szCs w:val="20"/>
-              </w:rPr>
-              <w:t>._</w:t>
-            </w:r>
-            <w:proofErr w:type="spellStart"/>
-            <w:r>
-              <w:rPr>
-                <w:rFonts w:ascii="Arial" w:hAnsi="Arial" w:cs="Arial"/>
-                <w:color w:val="000000"/>
-                <w:sz w:val="20"/>
-                <w:szCs w:val="20"/>
-              </w:rPr>
-              <w:t>nomor</w:t>
-            </w:r>
-            <w:proofErr w:type="spellEnd"/>
-            <w:r>
-              <w:rPr>
-                <w:rFonts w:ascii="Arial" w:hAnsi="Arial" w:cs="Arial"/>
-                <w:color w:val="000000"/>
-                <w:sz w:val="20"/>
-                <w:szCs w:val="20"/>
-              </w:rPr>
-              <w:t>}}.</w:t>
+              <w:t>{{*panitia._nomor}}.</w:t>
             </w:r>
           </w:p>
         </w:tc>
@@ -774,15 +734,7 @@
               </w:rPr>
             </w:pPr>
             <w:r>
-              <w:t>{{?</w:t>
-            </w:r>
-            <w:proofErr w:type="spellStart"/>
-            <w:r>
-              <w:t>panitia.nip</w:t>
-            </w:r>
-            <w:proofErr w:type="spellEnd"/>
-            <w:r>
-              <w:t>}}</w:t>
+              <w:t>{{?panitia.nip}}</w:t>
             </w:r>
           </w:p>
         </w:tc>
@@ -860,27 +812,7 @@
                 <w:sz w:val="20"/>
                 <w:szCs w:val="20"/>
               </w:rPr>
-              <w:t>{{*</w:t>
-            </w:r>
-            <w:proofErr w:type="spellStart"/>
-            <w:r>
-              <w:rPr>
-                <w:rFonts w:ascii="Arial" w:hAnsi="Arial" w:cs="Arial"/>
-                <w:color w:val="000000"/>
-                <w:sz w:val="20"/>
-                <w:szCs w:val="20"/>
-              </w:rPr>
-              <w:t>panitia.nip</w:t>
-            </w:r>
-            <w:proofErr w:type="spellEnd"/>
-            <w:r>
-              <w:rPr>
-                <w:rFonts w:ascii="Arial" w:hAnsi="Arial" w:cs="Arial"/>
-                <w:color w:val="000000"/>
-                <w:sz w:val="20"/>
-                <w:szCs w:val="20"/>
-              </w:rPr>
-              <w:t>}}</w:t>
+              <w:t>{{*panitia.nip}}</w:t>
             </w:r>
           </w:p>
         </w:tc>
@@ -918,7 +850,6 @@
                 <w:szCs w:val="20"/>
               </w:rPr>
             </w:pPr>
-            <w:proofErr w:type="spellStart"/>
             <w:r>
               <w:rPr>
                 <w:rFonts w:ascii="Arial" w:hAnsi="Arial" w:cs="Arial"/>
@@ -928,7 +859,6 @@
               </w:rPr>
               <w:t>Jabatan</w:t>
             </w:r>
-            <w:proofErr w:type="spellEnd"/>
           </w:p>
         </w:tc>
         <w:tc>
@@ -1009,27 +939,7 @@
                 <w:sz w:val="20"/>
                 <w:szCs w:val="20"/>
               </w:rPr>
-              <w:t>{{/</w:t>
-            </w:r>
-            <w:proofErr w:type="spellStart"/>
-            <w:r>
-              <w:rPr>
-                <w:rFonts w:ascii="Arial" w:hAnsi="Arial" w:cs="Arial"/>
-                <w:color w:val="000000"/>
-                <w:sz w:val="20"/>
-                <w:szCs w:val="20"/>
-              </w:rPr>
-              <w:t>panitia</w:t>
-            </w:r>
-            <w:proofErr w:type="spellEnd"/>
-            <w:r>
-              <w:rPr>
-                <w:rFonts w:ascii="Arial" w:hAnsi="Arial" w:cs="Arial"/>
-                <w:color w:val="000000"/>
-                <w:sz w:val="20"/>
-                <w:szCs w:val="20"/>
-              </w:rPr>
-              <w:t>}}</w:t>
+              <w:t>{{/panitia}}</w:t>
             </w:r>
           </w:p>
         </w:tc>
@@ -1181,27 +1091,7 @@
           <w:sz w:val="20"/>
           <w:szCs w:val="20"/>
         </w:rPr>
-        <w:t>{{</w:t>
-      </w:r>
-      <w:proofErr w:type="spellStart"/>
-      <w:r>
-        <w:rPr>
-          <w:rFonts w:ascii="Arial" w:hAnsi="Arial" w:cs="Arial"/>
-          <w:color w:val="000000"/>
-          <w:sz w:val="20"/>
-          <w:szCs w:val="20"/>
-        </w:rPr>
-        <w:t>luas_terbilang</w:t>
-      </w:r>
-      <w:proofErr w:type="spellEnd"/>
-      <w:r>
-        <w:rPr>
-          <w:rFonts w:ascii="Arial" w:hAnsi="Arial" w:cs="Arial"/>
-          <w:color w:val="000000"/>
-          <w:sz w:val="20"/>
-          <w:szCs w:val="20"/>
-        </w:rPr>
-        <w:t>}}</w:t>
+        <w:t>{{luas_terbilang}}</w:t>
       </w:r>
       <w:r>
         <w:rPr>
@@ -1212,17 +1102,91 @@
         </w:rPr>
         <w:t xml:space="preserve"> </w:t>
       </w:r>
-      <w:proofErr w:type="spellStart"/>
-      <w:r>
-        <w:rPr>
-          <w:rFonts w:ascii="Arial" w:hAnsi="Arial" w:cs="Arial"/>
-          <w:color w:val="000000"/>
-          <w:sz w:val="20"/>
-          <w:szCs w:val="20"/>
-        </w:rPr>
-        <w:t>sesuai</w:t>
-      </w:r>
-      <w:proofErr w:type="spellEnd"/>
+      <w:r>
+        <w:rPr>
+          <w:rFonts w:ascii="Arial" w:hAnsi="Arial" w:cs="Arial"/>
+          <w:color w:val="000000"/>
+          <w:sz w:val="20"/>
+          <w:szCs w:val="20"/>
+        </w:rPr>
+        <w:t xml:space="preserve">sesuai dengan Peta Bidang </w:t>
+      </w:r>
+      <w:r>
+        <w:rPr>
+          <w:rFonts w:ascii="Arial" w:hAnsi="Arial" w:cs="Arial"/>
+          <w:color w:val="000000"/>
+          <w:sz w:val="20"/>
+          <w:szCs w:val="20"/>
+        </w:rPr>
+        <w:t xml:space="preserve">Tanah </w:t>
+      </w:r>
+      <w:r>
+        <w:rPr>
+          <w:rFonts w:ascii="Arial" w:hAnsi="Arial" w:cs="Arial"/>
+          <w:color w:val="000000"/>
+          <w:sz w:val="20"/>
+          <w:szCs w:val="20"/>
+        </w:rPr>
+        <w:t xml:space="preserve">Nomor </w:t>
+      </w:r>
+      <w:r>
+        <w:rPr>
+          <w:rFonts w:ascii="Arial" w:hAnsi="Arial" w:cs="Arial"/>
+          <w:noProof/>
+          <w:color w:val="000000"/>
+          <w:sz w:val="20"/>
+          <w:szCs w:val="20"/>
+        </w:rPr>
+        <w:t>{{nomor_pbt}}</w:t>
+      </w:r>
+      <w:r>
+        <w:rPr>
+          <w:rFonts w:ascii="Arial" w:hAnsi="Arial" w:cs="Arial"/>
+          <w:color w:val="000000"/>
+          <w:sz w:val="20"/>
+          <w:szCs w:val="20"/>
+        </w:rPr>
+        <w:t xml:space="preserve"> tanggal </w:t>
+      </w:r>
+      <w:r>
+        <w:rPr>
+          <w:rFonts w:ascii="Arial" w:hAnsi="Arial" w:cs="Arial"/>
+          <w:noProof/>
+          <w:color w:val="000000"/>
+          <w:sz w:val="20"/>
+          <w:szCs w:val="20"/>
+          <w:lang w:val="id-ID"/>
+        </w:rPr>
+        <w:t>{{tanggal_pbt}}</w:t>
+      </w:r>
+      <w:r>
+        <w:rPr>
+          <w:rFonts w:ascii="Arial" w:hAnsi="Arial" w:cs="Arial"/>
+          <w:color w:val="000000"/>
+          <w:sz w:val="20"/>
+          <w:szCs w:val="20"/>
+        </w:rPr>
+        <w:t xml:space="preserve"> NIB. </w:t>
+      </w:r>
+      <w:r>
+        <w:rPr>
+          <w:rFonts w:ascii="Arial" w:hAnsi="Arial" w:cs="Arial"/>
+          <w:noProof/>
+          <w:color w:val="000000"/>
+          <w:sz w:val="20"/>
+          <w:szCs w:val="20"/>
+        </w:rPr>
+        <w:t>{{nib}}</w:t>
+      </w:r>
+      <w:r>
+        <w:rPr>
+          <w:rFonts w:ascii="Arial" w:hAnsi="Arial" w:cs="Arial"/>
+          <w:color w:val="000000"/>
+          <w:sz w:val="20"/>
+          <w:szCs w:val="20"/>
+        </w:rPr>
+        <w:t xml:space="preserve"> terletak di</w:t>
+      </w:r>
       <w:r>
         <w:rPr>
           <w:rFonts w:ascii="Arial" w:hAnsi="Arial" w:cs="Arial"/>
@@ -1232,44 +1196,6 @@
         </w:rPr>
         <w:t xml:space="preserve"> </w:t>
       </w:r>
-      <w:proofErr w:type="spellStart"/>
-      <w:r>
-        <w:rPr>
-          <w:rFonts w:ascii="Arial" w:hAnsi="Arial" w:cs="Arial"/>
-          <w:color w:val="000000"/>
-          <w:sz w:val="20"/>
-          <w:szCs w:val="20"/>
-        </w:rPr>
-        <w:t>dengan</w:t>
-      </w:r>
-      <w:proofErr w:type="spellEnd"/>
-      <w:r>
-        <w:rPr>
-          <w:rFonts w:ascii="Arial" w:hAnsi="Arial" w:cs="Arial"/>
-          <w:color w:val="000000"/>
-          <w:sz w:val="20"/>
-          <w:szCs w:val="20"/>
-        </w:rPr>
-        <w:t xml:space="preserve"> Peta Bidang </w:t>
-      </w:r>
-      <w:r>
-        <w:rPr>
-          <w:rFonts w:ascii="Arial" w:hAnsi="Arial" w:cs="Arial"/>
-          <w:color w:val="000000"/>
-          <w:sz w:val="20"/>
-          <w:szCs w:val="20"/>
-        </w:rPr>
-        <w:t xml:space="preserve">Tanah </w:t>
-      </w:r>
-      <w:r>
-        <w:rPr>
-          <w:rFonts w:ascii="Arial" w:hAnsi="Arial" w:cs="Arial"/>
-          <w:color w:val="000000"/>
-          <w:sz w:val="20"/>
-          <w:szCs w:val="20"/>
-        </w:rPr>
-        <w:t xml:space="preserve">Nomor </w:t>
-      </w:r>
       <w:r>
         <w:rPr>
           <w:rFonts w:ascii="Arial" w:hAnsi="Arial" w:cs="Arial"/>
@@ -1278,16 +1204,16 @@
           <w:sz w:val="20"/>
           <w:szCs w:val="20"/>
         </w:rPr>
-        <w:t>{{nomor_pbt}}</w:t>
-      </w:r>
-      <w:r>
-        <w:rPr>
-          <w:rFonts w:ascii="Arial" w:hAnsi="Arial" w:cs="Arial"/>
-          <w:color w:val="000000"/>
-          <w:sz w:val="20"/>
-          <w:szCs w:val="20"/>
-        </w:rPr>
-        <w:t xml:space="preserve"> tanggal </w:t>
+        <w:t>{{jenis_desa}}</w:t>
+      </w:r>
+      <w:r>
+        <w:rPr>
+          <w:rFonts w:ascii="Arial" w:hAnsi="Arial" w:cs="Arial"/>
+          <w:color w:val="000000"/>
+          <w:sz w:val="20"/>
+          <w:szCs w:val="20"/>
+        </w:rPr>
+        <w:t xml:space="preserve"> </w:t>
       </w:r>
       <w:r>
         <w:rPr>
@@ -1298,16 +1224,26 @@
           <w:szCs w:val="20"/>
           <w:lang w:val="id-ID"/>
         </w:rPr>
-        <w:t>{{tanggal_pbt}}</w:t>
-      </w:r>
-      <w:r>
-        <w:rPr>
-          <w:rFonts w:ascii="Arial" w:hAnsi="Arial" w:cs="Arial"/>
-          <w:color w:val="000000"/>
-          <w:sz w:val="20"/>
-          <w:szCs w:val="20"/>
-        </w:rPr>
-        <w:t xml:space="preserve"> NIB. </w:t>
+        <w:t>{{nama_desa}}</w:t>
+      </w:r>
+      <w:r>
+        <w:rPr>
+          <w:rFonts w:ascii="Arial" w:hAnsi="Arial" w:cs="Arial"/>
+          <w:color w:val="000000"/>
+          <w:sz w:val="20"/>
+          <w:szCs w:val="20"/>
+          <w:lang w:val="id-ID"/>
+        </w:rPr>
+        <w:t>,</w:t>
+      </w:r>
+      <w:r>
+        <w:rPr>
+          <w:rFonts w:ascii="Arial" w:hAnsi="Arial" w:cs="Arial"/>
+          <w:color w:val="000000"/>
+          <w:sz w:val="20"/>
+          <w:szCs w:val="20"/>
+        </w:rPr>
+        <w:t xml:space="preserve"> Kecamatan </w:t>
       </w:r>
       <w:r>
         <w:rPr>
@@ -1317,75 +1253,35 @@
           <w:sz w:val="20"/>
           <w:szCs w:val="20"/>
         </w:rPr>
-        <w:t>{{nib}}</w:t>
-      </w:r>
-      <w:r>
-        <w:rPr>
-          <w:rFonts w:ascii="Arial" w:hAnsi="Arial" w:cs="Arial"/>
-          <w:color w:val="000000"/>
-          <w:sz w:val="20"/>
-          <w:szCs w:val="20"/>
-        </w:rPr>
-        <w:t xml:space="preserve"> </w:t>
-      </w:r>
-      <w:proofErr w:type="spellStart"/>
-      <w:r>
-        <w:rPr>
-          <w:rFonts w:ascii="Arial" w:hAnsi="Arial" w:cs="Arial"/>
-          <w:color w:val="000000"/>
-          <w:sz w:val="20"/>
-          <w:szCs w:val="20"/>
-        </w:rPr>
-        <w:t>terletak</w:t>
-      </w:r>
-      <w:proofErr w:type="spellEnd"/>
-      <w:r>
-        <w:rPr>
-          <w:rFonts w:ascii="Arial" w:hAnsi="Arial" w:cs="Arial"/>
-          <w:color w:val="000000"/>
-          <w:sz w:val="20"/>
-          <w:szCs w:val="20"/>
-        </w:rPr>
-        <w:t xml:space="preserve"> di</w:t>
-      </w:r>
-      <w:r>
-        <w:rPr>
-          <w:rFonts w:ascii="Arial" w:hAnsi="Arial" w:cs="Arial"/>
-          <w:color w:val="000000"/>
-          <w:sz w:val="20"/>
-          <w:szCs w:val="20"/>
-        </w:rPr>
-        <w:t xml:space="preserve"> </w:t>
-      </w:r>
-      <w:r>
-        <w:rPr>
-          <w:rFonts w:ascii="Arial" w:hAnsi="Arial" w:cs="Arial"/>
-          <w:noProof/>
-          <w:color w:val="000000"/>
-          <w:sz w:val="20"/>
-          <w:szCs w:val="20"/>
-        </w:rPr>
-        <w:t>{{jenis_desa}}</w:t>
-      </w:r>
-      <w:r>
-        <w:rPr>
-          <w:rFonts w:ascii="Arial" w:hAnsi="Arial" w:cs="Arial"/>
-          <w:color w:val="000000"/>
-          <w:sz w:val="20"/>
-          <w:szCs w:val="20"/>
-        </w:rPr>
-        <w:t xml:space="preserve"> </w:t>
-      </w:r>
-      <w:r>
-        <w:rPr>
-          <w:rFonts w:ascii="Arial" w:hAnsi="Arial" w:cs="Arial"/>
-          <w:noProof/>
+        <w:t>{{kecamatan}}</w:t>
+      </w:r>
+      <w:r>
+        <w:rPr>
+          <w:rFonts w:ascii="Arial" w:hAnsi="Arial" w:cs="Arial"/>
           <w:color w:val="000000"/>
           <w:sz w:val="20"/>
           <w:szCs w:val="20"/>
           <w:lang w:val="id-ID"/>
         </w:rPr>
-        <w:t>{{nama_desa}}</w:t>
+        <w:t>,</w:t>
+      </w:r>
+      <w:r>
+        <w:rPr>
+          <w:rFonts w:ascii="Arial" w:hAnsi="Arial" w:cs="Arial"/>
+          <w:color w:val="000000"/>
+          <w:sz w:val="20"/>
+          <w:szCs w:val="20"/>
+        </w:rPr>
+        <w:t xml:space="preserve"> Kabupaten </w:t>
+      </w:r>
+      <w:r>
+        <w:rPr>
+          <w:rFonts w:ascii="Arial" w:hAnsi="Arial" w:cs="Arial"/>
+          <w:color w:val="000000"/>
+          <w:sz w:val="20"/>
+          <w:szCs w:val="20"/>
+        </w:rPr>
+        <w:t>Bone Bolango</w:t>
       </w:r>
       <w:r>
         <w:rPr>
@@ -1404,215 +1300,7 @@
           <w:sz w:val="20"/>
           <w:szCs w:val="20"/>
         </w:rPr>
-        <w:t xml:space="preserve"> </w:t>
-      </w:r>
-      <w:proofErr w:type="spellStart"/>
-      <w:r>
-        <w:rPr>
-          <w:rFonts w:ascii="Arial" w:hAnsi="Arial" w:cs="Arial"/>
-          <w:color w:val="000000"/>
-          <w:sz w:val="20"/>
-          <w:szCs w:val="20"/>
-        </w:rPr>
-        <w:t>Kecamatan</w:t>
-      </w:r>
-      <w:proofErr w:type="spellEnd"/>
-      <w:r>
-        <w:rPr>
-          <w:rFonts w:ascii="Arial" w:hAnsi="Arial" w:cs="Arial"/>
-          <w:color w:val="000000"/>
-          <w:sz w:val="20"/>
-          <w:szCs w:val="20"/>
-        </w:rPr>
-        <w:t xml:space="preserve"> </w:t>
-      </w:r>
-      <w:r>
-        <w:rPr>
-          <w:rFonts w:ascii="Arial" w:hAnsi="Arial" w:cs="Arial"/>
-          <w:noProof/>
-          <w:color w:val="000000"/>
-          <w:sz w:val="20"/>
-          <w:szCs w:val="20"/>
-        </w:rPr>
-        <w:t>{{kecamatan}}</w:t>
-      </w:r>
-      <w:r>
-        <w:rPr>
-          <w:rFonts w:ascii="Arial" w:hAnsi="Arial" w:cs="Arial"/>
-          <w:color w:val="000000"/>
-          <w:sz w:val="20"/>
-          <w:szCs w:val="20"/>
-          <w:lang w:val="id-ID"/>
-        </w:rPr>
-        <w:t>,</w:t>
-      </w:r>
-      <w:r>
-        <w:rPr>
-          <w:rFonts w:ascii="Arial" w:hAnsi="Arial" w:cs="Arial"/>
-          <w:color w:val="000000"/>
-          <w:sz w:val="20"/>
-          <w:szCs w:val="20"/>
-        </w:rPr>
-        <w:t xml:space="preserve"> </w:t>
-      </w:r>
-      <w:proofErr w:type="spellStart"/>
-      <w:r>
-        <w:rPr>
-          <w:rFonts w:ascii="Arial" w:hAnsi="Arial" w:cs="Arial"/>
-          <w:color w:val="000000"/>
-          <w:sz w:val="20"/>
-          <w:szCs w:val="20"/>
-        </w:rPr>
-        <w:t>Kabupaten</w:t>
-      </w:r>
-      <w:proofErr w:type="spellEnd"/>
-      <w:r>
-        <w:rPr>
-          <w:rFonts w:ascii="Arial" w:hAnsi="Arial" w:cs="Arial"/>
-          <w:color w:val="000000"/>
-          <w:sz w:val="20"/>
-          <w:szCs w:val="20"/>
-        </w:rPr>
-        <w:t xml:space="preserve"> </w:t>
-      </w:r>
-      <w:r>
-        <w:rPr>
-          <w:rFonts w:ascii="Arial" w:hAnsi="Arial" w:cs="Arial"/>
-          <w:color w:val="000000"/>
-          <w:sz w:val="20"/>
-          <w:szCs w:val="20"/>
-        </w:rPr>
-        <w:t xml:space="preserve">Bone </w:t>
-      </w:r>
-      <w:proofErr w:type="spellStart"/>
-      <w:r>
-        <w:rPr>
-          <w:rFonts w:ascii="Arial" w:hAnsi="Arial" w:cs="Arial"/>
-          <w:color w:val="000000"/>
-          <w:sz w:val="20"/>
-          <w:szCs w:val="20"/>
-        </w:rPr>
-        <w:t>Bolango</w:t>
-      </w:r>
-      <w:proofErr w:type="spellEnd"/>
-      <w:r>
-        <w:rPr>
-          <w:rFonts w:ascii="Arial" w:hAnsi="Arial" w:cs="Arial"/>
-          <w:color w:val="000000"/>
-          <w:sz w:val="20"/>
-          <w:szCs w:val="20"/>
-          <w:lang w:val="id-ID"/>
-        </w:rPr>
-        <w:t>,</w:t>
-      </w:r>
-      <w:r>
-        <w:rPr>
-          <w:rFonts w:ascii="Arial" w:hAnsi="Arial" w:cs="Arial"/>
-          <w:color w:val="000000"/>
-          <w:sz w:val="20"/>
-          <w:szCs w:val="20"/>
-        </w:rPr>
-        <w:t xml:space="preserve"> </w:t>
-      </w:r>
-      <w:proofErr w:type="spellStart"/>
-      <w:r>
-        <w:rPr>
-          <w:rFonts w:ascii="Arial" w:hAnsi="Arial" w:cs="Arial"/>
-          <w:color w:val="000000"/>
-          <w:sz w:val="20"/>
-          <w:szCs w:val="20"/>
-        </w:rPr>
-        <w:t>Provinsi</w:t>
-      </w:r>
-      <w:proofErr w:type="spellEnd"/>
-      <w:r>
-        <w:rPr>
-          <w:rFonts w:ascii="Arial" w:hAnsi="Arial" w:cs="Arial"/>
-          <w:color w:val="000000"/>
-          <w:sz w:val="20"/>
-          <w:szCs w:val="20"/>
-        </w:rPr>
-        <w:t xml:space="preserve"> Gorontalo, </w:t>
-      </w:r>
-      <w:proofErr w:type="spellStart"/>
-      <w:r>
-        <w:rPr>
-          <w:rFonts w:ascii="Arial" w:hAnsi="Arial" w:cs="Arial"/>
-          <w:color w:val="000000"/>
-          <w:sz w:val="20"/>
-          <w:szCs w:val="20"/>
-        </w:rPr>
-        <w:t>dengan</w:t>
-      </w:r>
-      <w:proofErr w:type="spellEnd"/>
-      <w:r>
-        <w:rPr>
-          <w:rFonts w:ascii="Arial" w:hAnsi="Arial" w:cs="Arial"/>
-          <w:color w:val="000000"/>
-          <w:sz w:val="20"/>
-          <w:szCs w:val="20"/>
-        </w:rPr>
-        <w:t xml:space="preserve"> </w:t>
-      </w:r>
-      <w:proofErr w:type="spellStart"/>
-      <w:r>
-        <w:rPr>
-          <w:rFonts w:ascii="Arial" w:hAnsi="Arial" w:cs="Arial"/>
-          <w:color w:val="000000"/>
-          <w:sz w:val="20"/>
-          <w:szCs w:val="20"/>
-        </w:rPr>
-        <w:t>hasil</w:t>
-      </w:r>
-      <w:proofErr w:type="spellEnd"/>
-      <w:r>
-        <w:rPr>
-          <w:rFonts w:ascii="Arial" w:hAnsi="Arial" w:cs="Arial"/>
-          <w:color w:val="000000"/>
-          <w:sz w:val="20"/>
-          <w:szCs w:val="20"/>
-        </w:rPr>
-        <w:t xml:space="preserve"> </w:t>
-      </w:r>
-      <w:proofErr w:type="spellStart"/>
-      <w:r>
-        <w:rPr>
-          <w:rFonts w:ascii="Arial" w:hAnsi="Arial" w:cs="Arial"/>
-          <w:color w:val="000000"/>
-          <w:sz w:val="20"/>
-          <w:szCs w:val="20"/>
-        </w:rPr>
-        <w:t>sebagai</w:t>
-      </w:r>
-      <w:proofErr w:type="spellEnd"/>
-      <w:r>
-        <w:rPr>
-          <w:rFonts w:ascii="Arial" w:hAnsi="Arial" w:cs="Arial"/>
-          <w:color w:val="000000"/>
-          <w:sz w:val="20"/>
-          <w:szCs w:val="20"/>
-        </w:rPr>
-        <w:t xml:space="preserve"> </w:t>
-      </w:r>
-      <w:proofErr w:type="spellStart"/>
-      <w:r>
-        <w:rPr>
-          <w:rFonts w:ascii="Arial" w:hAnsi="Arial" w:cs="Arial"/>
-          <w:color w:val="000000"/>
-          <w:sz w:val="20"/>
-          <w:szCs w:val="20"/>
-        </w:rPr>
-        <w:t>berikut</w:t>
-      </w:r>
-      <w:proofErr w:type="spellEnd"/>
-      <w:r>
-        <w:rPr>
-          <w:rFonts w:ascii="Arial" w:hAnsi="Arial" w:cs="Arial"/>
-          <w:color w:val="000000"/>
-          <w:sz w:val="20"/>
-          <w:szCs w:val="20"/>
-        </w:rPr>
-        <w:t>:</w:t>
+        <w:t xml:space="preserve"> Provinsi Gorontalo, dengan hasil sebagai berikut:</w:t>
       </w:r>
     </w:p>
     <w:p>
@@ -1631,65 +1319,14 @@
           <w:szCs w:val="20"/>
         </w:rPr>
       </w:pPr>
-      <w:proofErr w:type="spellStart"/>
-      <w:r>
-        <w:rPr>
-          <w:rFonts w:ascii="Arial" w:hAnsi="Arial" w:cs="Arial"/>
-          <w:color w:val="000000"/>
-          <w:sz w:val="20"/>
-          <w:szCs w:val="20"/>
-        </w:rPr>
-        <w:t>Penguasaan</w:t>
-      </w:r>
-      <w:proofErr w:type="spellEnd"/>
-      <w:r>
-        <w:rPr>
-          <w:rFonts w:ascii="Arial" w:hAnsi="Arial" w:cs="Arial"/>
-          <w:color w:val="000000"/>
-          <w:sz w:val="20"/>
-          <w:szCs w:val="20"/>
-        </w:rPr>
-        <w:t xml:space="preserve">, </w:t>
-      </w:r>
-      <w:proofErr w:type="spellStart"/>
-      <w:r>
-        <w:rPr>
-          <w:rFonts w:ascii="Arial" w:hAnsi="Arial" w:cs="Arial"/>
-          <w:color w:val="000000"/>
-          <w:sz w:val="20"/>
-          <w:szCs w:val="20"/>
-        </w:rPr>
-        <w:t>Penggunaan</w:t>
-      </w:r>
-      <w:proofErr w:type="spellEnd"/>
-      <w:r>
-        <w:rPr>
-          <w:rFonts w:ascii="Arial" w:hAnsi="Arial" w:cs="Arial"/>
-          <w:color w:val="000000"/>
-          <w:sz w:val="20"/>
-          <w:szCs w:val="20"/>
-        </w:rPr>
-        <w:t xml:space="preserve"> dan </w:t>
-      </w:r>
-      <w:proofErr w:type="spellStart"/>
-      <w:r>
-        <w:rPr>
-          <w:rFonts w:ascii="Arial" w:hAnsi="Arial" w:cs="Arial"/>
-          <w:color w:val="000000"/>
-          <w:sz w:val="20"/>
-          <w:szCs w:val="20"/>
-        </w:rPr>
-        <w:t>Keadaan</w:t>
-      </w:r>
-      <w:proofErr w:type="spellEnd"/>
-      <w:r>
-        <w:rPr>
-          <w:rFonts w:ascii="Arial" w:hAnsi="Arial" w:cs="Arial"/>
-          <w:color w:val="000000"/>
-          <w:sz w:val="20"/>
-          <w:szCs w:val="20"/>
-        </w:rPr>
-        <w:t xml:space="preserve"> Tanah</w:t>
+      <w:r>
+        <w:rPr>
+          <w:rFonts w:ascii="Arial" w:hAnsi="Arial" w:cs="Arial"/>
+          <w:color w:val="000000"/>
+          <w:sz w:val="20"/>
+          <w:szCs w:val="20"/>
+        </w:rPr>
+        <w:t>Penguasaan, Penggunaan dan Keadaan Tanah</w:t>
       </w:r>
     </w:p>
     <w:p>
@@ -1708,15 +1345,20 @@
           <w:szCs w:val="20"/>
         </w:rPr>
       </w:pPr>
-      <w:proofErr w:type="spellStart"/>
-      <w:r>
-        <w:rPr>
-          <w:rFonts w:ascii="Arial" w:hAnsi="Arial" w:cs="Arial"/>
-          <w:sz w:val="20"/>
-        </w:rPr>
-        <w:t>Bahwa</w:t>
-      </w:r>
-      <w:proofErr w:type="spellEnd"/>
+      <w:r>
+        <w:rPr>
+          <w:rFonts w:ascii="Arial" w:hAnsi="Arial" w:cs="Arial"/>
+          <w:sz w:val="20"/>
+        </w:rPr>
+        <w:t xml:space="preserve">Bahwa bidang tanah yang dimohon </w:t>
+      </w:r>
+      <w:r>
+        <w:rPr>
+          <w:rFonts w:ascii="Arial" w:hAnsi="Arial" w:cs="Arial"/>
+          <w:sz w:val="20"/>
+        </w:rPr>
+        <w:t>merupakan tanah wakaf yang dikelola oleh Nazhir perseorangan yang terdiri dari</w:t>
+      </w:r>
       <w:r>
         <w:rPr>
           <w:rFonts w:ascii="Arial" w:hAnsi="Arial" w:cs="Arial"/>
@@ -1724,166 +1366,6 @@
         </w:rPr>
         <w:t xml:space="preserve"> </w:t>
       </w:r>
-      <w:proofErr w:type="spellStart"/>
-      <w:r>
-        <w:rPr>
-          <w:rFonts w:ascii="Arial" w:hAnsi="Arial" w:cs="Arial"/>
-          <w:sz w:val="20"/>
-        </w:rPr>
-        <w:t>bidang</w:t>
-      </w:r>
-      <w:proofErr w:type="spellEnd"/>
-      <w:r>
-        <w:rPr>
-          <w:rFonts w:ascii="Arial" w:hAnsi="Arial" w:cs="Arial"/>
-          <w:sz w:val="20"/>
-        </w:rPr>
-        <w:t xml:space="preserve"> </w:t>
-      </w:r>
-      <w:proofErr w:type="spellStart"/>
-      <w:r>
-        <w:rPr>
-          <w:rFonts w:ascii="Arial" w:hAnsi="Arial" w:cs="Arial"/>
-          <w:sz w:val="20"/>
-        </w:rPr>
-        <w:t>tanah</w:t>
-      </w:r>
-      <w:proofErr w:type="spellEnd"/>
-      <w:r>
-        <w:rPr>
-          <w:rFonts w:ascii="Arial" w:hAnsi="Arial" w:cs="Arial"/>
-          <w:sz w:val="20"/>
-        </w:rPr>
-        <w:t xml:space="preserve"> yang </w:t>
-      </w:r>
-      <w:proofErr w:type="spellStart"/>
-      <w:r>
-        <w:rPr>
-          <w:rFonts w:ascii="Arial" w:hAnsi="Arial" w:cs="Arial"/>
-          <w:sz w:val="20"/>
-        </w:rPr>
-        <w:t>dimohon</w:t>
-      </w:r>
-      <w:proofErr w:type="spellEnd"/>
-      <w:r>
-        <w:rPr>
-          <w:rFonts w:ascii="Arial" w:hAnsi="Arial" w:cs="Arial"/>
-          <w:sz w:val="20"/>
-        </w:rPr>
-        <w:t xml:space="preserve"> </w:t>
-      </w:r>
-      <w:proofErr w:type="spellStart"/>
-      <w:r>
-        <w:rPr>
-          <w:rFonts w:ascii="Arial" w:hAnsi="Arial" w:cs="Arial"/>
-          <w:sz w:val="20"/>
-        </w:rPr>
-        <w:t>merupakan</w:t>
-      </w:r>
-      <w:proofErr w:type="spellEnd"/>
-      <w:r>
-        <w:rPr>
-          <w:rFonts w:ascii="Arial" w:hAnsi="Arial" w:cs="Arial"/>
-          <w:sz w:val="20"/>
-        </w:rPr>
-        <w:t xml:space="preserve"> </w:t>
-      </w:r>
-      <w:proofErr w:type="spellStart"/>
-      <w:r>
-        <w:rPr>
-          <w:rFonts w:ascii="Arial" w:hAnsi="Arial" w:cs="Arial"/>
-          <w:sz w:val="20"/>
-        </w:rPr>
-        <w:t>tanah</w:t>
-      </w:r>
-      <w:proofErr w:type="spellEnd"/>
-      <w:r>
-        <w:rPr>
-          <w:rFonts w:ascii="Arial" w:hAnsi="Arial" w:cs="Arial"/>
-          <w:sz w:val="20"/>
-        </w:rPr>
-        <w:t xml:space="preserve"> </w:t>
-      </w:r>
-      <w:proofErr w:type="spellStart"/>
-      <w:r>
-        <w:rPr>
-          <w:rFonts w:ascii="Arial" w:hAnsi="Arial" w:cs="Arial"/>
-          <w:sz w:val="20"/>
-        </w:rPr>
-        <w:t>wakaf</w:t>
-      </w:r>
-      <w:proofErr w:type="spellEnd"/>
-      <w:r>
-        <w:rPr>
-          <w:rFonts w:ascii="Arial" w:hAnsi="Arial" w:cs="Arial"/>
-          <w:sz w:val="20"/>
-        </w:rPr>
-        <w:t xml:space="preserve"> yang </w:t>
-      </w:r>
-      <w:proofErr w:type="spellStart"/>
-      <w:r>
-        <w:rPr>
-          <w:rFonts w:ascii="Arial" w:hAnsi="Arial" w:cs="Arial"/>
-          <w:sz w:val="20"/>
-        </w:rPr>
-        <w:t>dikelola</w:t>
-      </w:r>
-      <w:proofErr w:type="spellEnd"/>
-      <w:r>
-        <w:rPr>
-          <w:rFonts w:ascii="Arial" w:hAnsi="Arial" w:cs="Arial"/>
-          <w:sz w:val="20"/>
-        </w:rPr>
-        <w:t xml:space="preserve"> oleh Nazhir </w:t>
-      </w:r>
-      <w:proofErr w:type="spellStart"/>
-      <w:r>
-        <w:rPr>
-          <w:rFonts w:ascii="Arial" w:hAnsi="Arial" w:cs="Arial"/>
-          <w:sz w:val="20"/>
-        </w:rPr>
-        <w:t>perseorangan</w:t>
-      </w:r>
-      <w:proofErr w:type="spellEnd"/>
-      <w:r>
-        <w:rPr>
-          <w:rFonts w:ascii="Arial" w:hAnsi="Arial" w:cs="Arial"/>
-          <w:sz w:val="20"/>
-        </w:rPr>
-        <w:t xml:space="preserve"> yang </w:t>
-      </w:r>
-      <w:proofErr w:type="spellStart"/>
-      <w:r>
-        <w:rPr>
-          <w:rFonts w:ascii="Arial" w:hAnsi="Arial" w:cs="Arial"/>
-          <w:sz w:val="20"/>
-        </w:rPr>
-        <w:t>terdiri</w:t>
-      </w:r>
-      <w:proofErr w:type="spellEnd"/>
-      <w:r>
-        <w:rPr>
-          <w:rFonts w:ascii="Arial" w:hAnsi="Arial" w:cs="Arial"/>
-          <w:sz w:val="20"/>
-        </w:rPr>
-        <w:t xml:space="preserve"> </w:t>
-      </w:r>
-      <w:proofErr w:type="spellStart"/>
-      <w:r>
-        <w:rPr>
-          <w:rFonts w:ascii="Arial" w:hAnsi="Arial" w:cs="Arial"/>
-          <w:sz w:val="20"/>
-        </w:rPr>
-        <w:t>dari</w:t>
-      </w:r>
-      <w:proofErr w:type="spellEnd"/>
-      <w:r>
-        <w:rPr>
-          <w:rFonts w:ascii="Arial" w:hAnsi="Arial" w:cs="Arial"/>
-          <w:sz w:val="20"/>
-        </w:rPr>
-        <w:t xml:space="preserve"> </w:t>
-      </w:r>
       <w:r>
         <w:rPr>
           <w:rFonts w:ascii="Arial" w:hAnsi="Arial" w:cs="Arial"/>
@@ -1901,47 +1383,7 @@
           <w:sz w:val="20"/>
           <w:szCs w:val="20"/>
         </w:rPr>
-        <w:t xml:space="preserve"> </w:t>
-      </w:r>
-      <w:proofErr w:type="spellStart"/>
-      <w:r>
-        <w:rPr>
-          <w:rFonts w:ascii="Arial" w:hAnsi="Arial" w:cs="Arial"/>
-          <w:color w:val="000000"/>
-          <w:sz w:val="20"/>
-          <w:szCs w:val="20"/>
-        </w:rPr>
-        <w:t>dengan</w:t>
-      </w:r>
-      <w:proofErr w:type="spellEnd"/>
-      <w:r>
-        <w:rPr>
-          <w:rFonts w:ascii="Arial" w:hAnsi="Arial" w:cs="Arial"/>
-          <w:color w:val="000000"/>
-          <w:sz w:val="20"/>
-          <w:szCs w:val="20"/>
-        </w:rPr>
-        <w:t xml:space="preserve"> </w:t>
-      </w:r>
-      <w:proofErr w:type="spellStart"/>
-      <w:r>
-        <w:rPr>
-          <w:rFonts w:ascii="Arial" w:hAnsi="Arial" w:cs="Arial"/>
-          <w:color w:val="000000"/>
-          <w:sz w:val="20"/>
-          <w:szCs w:val="20"/>
-        </w:rPr>
-        <w:t>riwayat</w:t>
-      </w:r>
-      <w:proofErr w:type="spellEnd"/>
-      <w:r>
-        <w:rPr>
-          <w:rFonts w:ascii="Arial" w:hAnsi="Arial" w:cs="Arial"/>
-          <w:color w:val="000000"/>
-          <w:sz w:val="20"/>
-          <w:szCs w:val="20"/>
-        </w:rPr>
-        <w:t>;</w:t>
+        <w:t xml:space="preserve"> dengan riwayat;</w:t>
       </w:r>
     </w:p>
     <w:p>
@@ -1983,43 +1425,7 @@
           <w:sz w:val="20"/>
           <w:szCs w:val="20"/>
         </w:rPr>
-        <w:t>{{*</w:t>
-      </w:r>
-      <w:proofErr w:type="spellStart"/>
-      <w:r>
-        <w:rPr>
-          <w:rFonts w:ascii="Arial" w:hAnsi="Arial" w:cs="Arial"/>
-          <w:sz w:val="20"/>
-          <w:szCs w:val="20"/>
-        </w:rPr>
-        <w:t>riwayat</w:t>
-      </w:r>
-      <w:proofErr w:type="spellEnd"/>
-      <w:r>
-        <w:rPr>
-          <w:rFonts w:ascii="Arial" w:hAnsi="Arial" w:cs="Arial"/>
-          <w:sz w:val="20"/>
-          <w:szCs w:val="20"/>
-        </w:rPr>
-        <w:t>._</w:t>
-      </w:r>
-      <w:proofErr w:type="spellStart"/>
-      <w:r>
-        <w:rPr>
-          <w:rFonts w:ascii="Arial" w:hAnsi="Arial" w:cs="Arial"/>
-          <w:sz w:val="20"/>
-          <w:szCs w:val="20"/>
-        </w:rPr>
-        <w:t>akhir</w:t>
-      </w:r>
-      <w:proofErr w:type="spellEnd"/>
-      <w:r>
-        <w:rPr>
-          <w:rFonts w:ascii="Arial" w:hAnsi="Arial" w:cs="Arial"/>
-          <w:sz w:val="20"/>
-          <w:szCs w:val="20"/>
-        </w:rPr>
-        <w:t>}}</w:t>
+        <w:t>{{*riwayat._akhir}}</w:t>
       </w:r>
     </w:p>
     <w:p>
@@ -2079,25 +1485,14 @@
           <w:szCs w:val="20"/>
         </w:rPr>
       </w:pPr>
-      <w:proofErr w:type="spellStart"/>
-      <w:r>
-        <w:rPr>
-          <w:rFonts w:ascii="Arial" w:hAnsi="Arial" w:cs="Arial"/>
-          <w:color w:val="000000"/>
-          <w:sz w:val="20"/>
-          <w:szCs w:val="20"/>
-        </w:rPr>
-        <w:t>Pengunaan</w:t>
-      </w:r>
-      <w:proofErr w:type="spellEnd"/>
-      <w:r>
-        <w:rPr>
-          <w:rFonts w:ascii="Arial" w:hAnsi="Arial" w:cs="Arial"/>
-          <w:color w:val="000000"/>
-          <w:sz w:val="20"/>
-          <w:szCs w:val="20"/>
-        </w:rPr>
-        <w:t xml:space="preserve"> Tanah </w:t>
+      <w:r>
+        <w:rPr>
+          <w:rFonts w:ascii="Arial" w:hAnsi="Arial" w:cs="Arial"/>
+          <w:color w:val="000000"/>
+          <w:sz w:val="20"/>
+          <w:szCs w:val="20"/>
+        </w:rPr>
+        <w:t xml:space="preserve">Pengunaan Tanah </w:t>
       </w:r>
     </w:p>
     <w:p>
@@ -2184,206 +1579,9 @@
         <w:rPr>
           <w:rFonts w:ascii="Arial" w:hAnsi="Arial" w:cs="Arial"/>
           <w:sz w:val="20"/>
-          <w:szCs w:val="20"/>
-        </w:rPr>
-        <w:t>B</w:t>
-      </w:r>
-      <w:r>
-        <w:rPr>
-          <w:rFonts w:ascii="Arial" w:hAnsi="Arial" w:cs="Arial"/>
-          <w:sz w:val="20"/>
-          <w:szCs w:val="20"/>
-        </w:rPr>
-        <w:t xml:space="preserve">erdasarkan Peta </w:t>
-      </w:r>
-      <w:proofErr w:type="spellStart"/>
-      <w:r>
-        <w:rPr>
-          <w:rFonts w:ascii="Arial" w:hAnsi="Arial" w:cs="Arial"/>
-          <w:sz w:val="20"/>
-          <w:szCs w:val="20"/>
-        </w:rPr>
-        <w:t>Analisis</w:t>
-      </w:r>
-      <w:proofErr w:type="spellEnd"/>
-      <w:r>
-        <w:rPr>
-          <w:rFonts w:ascii="Arial" w:hAnsi="Arial" w:cs="Arial"/>
-          <w:sz w:val="20"/>
-          <w:szCs w:val="20"/>
-        </w:rPr>
-        <w:t xml:space="preserve"> </w:t>
-      </w:r>
-      <w:proofErr w:type="spellStart"/>
-      <w:r>
-        <w:rPr>
-          <w:rFonts w:ascii="Arial" w:hAnsi="Arial" w:cs="Arial"/>
-          <w:sz w:val="20"/>
-          <w:szCs w:val="20"/>
-        </w:rPr>
-        <w:t>Penatagunaan</w:t>
-      </w:r>
-      <w:proofErr w:type="spellEnd"/>
-      <w:r>
-        <w:rPr>
-          <w:rFonts w:ascii="Arial" w:hAnsi="Arial" w:cs="Arial"/>
-          <w:sz w:val="20"/>
-          <w:szCs w:val="20"/>
-        </w:rPr>
-        <w:t xml:space="preserve"> Tanah </w:t>
-      </w:r>
-      <w:proofErr w:type="spellStart"/>
-      <w:r>
-        <w:rPr>
-          <w:rFonts w:ascii="Arial" w:hAnsi="Arial" w:cs="Arial"/>
-          <w:sz w:val="20"/>
-          <w:szCs w:val="20"/>
-        </w:rPr>
-        <w:t>tanggal</w:t>
-      </w:r>
-      <w:proofErr w:type="spellEnd"/>
-      <w:r>
-        <w:rPr>
-          <w:rFonts w:ascii="Arial" w:hAnsi="Arial" w:cs="Arial"/>
-          <w:sz w:val="20"/>
-          <w:szCs w:val="20"/>
-        </w:rPr>
-        <w:t xml:space="preserve"> </w:t>
-      </w:r>
-      <w:r>
-        <w:rPr>
-          <w:rFonts w:ascii="Arial" w:hAnsi="Arial" w:cs="Arial"/>
-          <w:sz w:val="20"/>
-          <w:szCs w:val="20"/>
-        </w:rPr>
-        <w:t>{{</w:t>
-      </w:r>
-      <w:proofErr w:type="spellStart"/>
-      <w:r>
-        <w:rPr>
-          <w:rFonts w:ascii="Arial" w:hAnsi="Arial" w:cs="Arial"/>
-          <w:sz w:val="20"/>
-          <w:szCs w:val="20"/>
-        </w:rPr>
-        <w:t>tanggal_peta_analisis</w:t>
-      </w:r>
-      <w:proofErr w:type="spellEnd"/>
-      <w:r>
-        <w:rPr>
-          <w:rFonts w:ascii="Arial" w:hAnsi="Arial" w:cs="Arial"/>
-          <w:sz w:val="20"/>
-          <w:szCs w:val="20"/>
-        </w:rPr>
-        <w:t>}}</w:t>
-      </w:r>
-      <w:r>
-        <w:rPr>
-          <w:rFonts w:ascii="Arial" w:hAnsi="Arial" w:cs="Arial"/>
-          <w:sz w:val="20"/>
-          <w:szCs w:val="20"/>
-        </w:rPr>
-        <w:t xml:space="preserve"> yang di</w:t>
-      </w:r>
-      <w:r>
-        <w:rPr>
-          <w:rFonts w:ascii="Arial" w:hAnsi="Arial" w:cs="Arial"/>
-          <w:sz w:val="20"/>
-          <w:szCs w:val="20"/>
-        </w:rPr>
-        <w:t xml:space="preserve"> </w:t>
-      </w:r>
-      <w:proofErr w:type="spellStart"/>
-      <w:r>
-        <w:rPr>
-          <w:rFonts w:ascii="Arial" w:hAnsi="Arial" w:cs="Arial"/>
-          <w:sz w:val="20"/>
-          <w:szCs w:val="20"/>
-        </w:rPr>
-        <w:t>tandatangani</w:t>
-      </w:r>
-      <w:proofErr w:type="spellEnd"/>
-      <w:r>
-        <w:rPr>
-          <w:rFonts w:ascii="Arial" w:hAnsi="Arial" w:cs="Arial"/>
-          <w:sz w:val="20"/>
-          <w:szCs w:val="20"/>
-        </w:rPr>
-        <w:t xml:space="preserve"> oleh </w:t>
-      </w:r>
-      <w:proofErr w:type="spellStart"/>
-      <w:r>
-        <w:rPr>
-          <w:rFonts w:ascii="Arial" w:hAnsi="Arial" w:cs="Arial"/>
-          <w:sz w:val="20"/>
-          <w:szCs w:val="20"/>
-        </w:rPr>
-        <w:t>Kepala</w:t>
-      </w:r>
-      <w:proofErr w:type="spellEnd"/>
-      <w:r>
-        <w:rPr>
-          <w:rFonts w:ascii="Arial" w:hAnsi="Arial" w:cs="Arial"/>
-          <w:sz w:val="20"/>
-          <w:szCs w:val="20"/>
-        </w:rPr>
-        <w:t xml:space="preserve"> Seksi Penataan dan </w:t>
-      </w:r>
-      <w:r>
-        <w:rPr>
-          <w:rFonts w:ascii="Arial" w:hAnsi="Arial" w:cs="Arial"/>
-          <w:sz w:val="20"/>
-          <w:szCs w:val="20"/>
-        </w:rPr>
-        <w:t>P</w:t>
-      </w:r>
-      <w:r>
-        <w:rPr>
-          <w:rFonts w:ascii="Arial" w:hAnsi="Arial" w:cs="Arial"/>
-          <w:sz w:val="20"/>
-          <w:szCs w:val="20"/>
-        </w:rPr>
-        <w:t>emberdayaan Kantor Pertanahan Kabupaten Bone Bolango</w:t>
-      </w:r>
-      <w:r>
-        <w:rPr>
-          <w:rFonts w:ascii="Arial" w:hAnsi="Arial" w:cs="Arial"/>
-          <w:sz w:val="20"/>
-          <w:szCs w:val="20"/>
-        </w:rPr>
-        <w:t>,</w:t>
-      </w:r>
-      <w:r>
-        <w:rPr>
-          <w:rFonts w:ascii="Arial" w:hAnsi="Arial" w:cs="Arial"/>
-          <w:sz w:val="20"/>
-          <w:szCs w:val="20"/>
-        </w:rPr>
-        <w:t xml:space="preserve"> </w:t>
-      </w:r>
-      <w:r>
-        <w:rPr>
-          <w:rFonts w:ascii="Arial" w:hAnsi="Arial" w:cs="Arial"/>
-          <w:sz w:val="20"/>
-          <w:szCs w:val="20"/>
-        </w:rPr>
-        <w:t xml:space="preserve">bidang tanah yang dimohon berada dalam </w:t>
-      </w:r>
-      <w:r>
-        <w:rPr>
-          <w:rFonts w:ascii="Arial" w:hAnsi="Arial" w:cs="Arial"/>
-          <w:noProof/>
-          <w:sz w:val="20"/>
           <w:szCs w:val="19"/>
         </w:rPr>
-        <w:t>{{rtrw}}</w:t>
-      </w:r>
-      <w:r>
-        <w:rPr>
-          <w:rFonts w:ascii="Arial" w:hAnsi="Arial" w:cs="Arial"/>
-          <w:sz w:val="20"/>
-          <w:szCs w:val="19"/>
-        </w:rPr>
-        <w:t xml:space="preserve">, sehingga bidang tanah tersebut </w:t>
+        <w:t xml:space="preserve">sehingga bidang tanah tersebut </w:t>
       </w:r>
       <w:r>
         <w:rPr>
@@ -2460,7 +1658,6 @@
           <w:szCs w:val="20"/>
         </w:rPr>
       </w:pPr>
-      <w:proofErr w:type="spellStart"/>
       <w:r>
         <w:rPr>
           <w:rFonts w:ascii="Arial" w:hAnsi="Arial" w:cs="Arial"/>
@@ -2470,7 +1667,6 @@
         </w:rPr>
         <w:t>Keadaan</w:t>
       </w:r>
-      <w:proofErr w:type="spellEnd"/>
       <w:r>
         <w:rPr>
           <w:rFonts w:ascii="Arial" w:hAnsi="Arial" w:cs="Arial"/>
@@ -2496,23 +1692,13 @@
           <w:szCs w:val="20"/>
         </w:rPr>
       </w:pPr>
-      <w:proofErr w:type="spellStart"/>
-      <w:r>
-        <w:rPr>
-          <w:rFonts w:ascii="Arial" w:hAnsi="Arial" w:cs="Arial"/>
-          <w:sz w:val="20"/>
-          <w:szCs w:val="20"/>
-        </w:rPr>
-        <w:t>Bahwa</w:t>
-      </w:r>
-      <w:proofErr w:type="spellEnd"/>
-      <w:r>
-        <w:rPr>
-          <w:rFonts w:ascii="Arial" w:hAnsi="Arial" w:cs="Arial"/>
-          <w:sz w:val="20"/>
-          <w:szCs w:val="20"/>
-        </w:rPr>
-        <w:t xml:space="preserve"> </w:t>
+      <w:r>
+        <w:rPr>
+          <w:rFonts w:ascii="Arial" w:hAnsi="Arial" w:cs="Arial"/>
+          <w:sz w:val="20"/>
+          <w:szCs w:val="20"/>
+        </w:rPr>
+        <w:t xml:space="preserve">Bahwa </w:t>
       </w:r>
       <w:r>
         <w:rPr>
@@ -2529,61 +1715,7 @@
           <w:sz w:val="20"/>
           <w:szCs w:val="20"/>
         </w:rPr>
-        <w:t xml:space="preserve"> </w:t>
-      </w:r>
-      <w:proofErr w:type="spellStart"/>
-      <w:r>
-        <w:rPr>
-          <w:rFonts w:ascii="Arial" w:hAnsi="Arial" w:cs="Arial"/>
-          <w:sz w:val="20"/>
-          <w:szCs w:val="20"/>
-        </w:rPr>
-        <w:t>tanah</w:t>
-      </w:r>
-      <w:proofErr w:type="spellEnd"/>
-      <w:r>
-        <w:rPr>
-          <w:rFonts w:ascii="Arial" w:hAnsi="Arial" w:cs="Arial"/>
-          <w:sz w:val="20"/>
-          <w:szCs w:val="20"/>
-        </w:rPr>
-        <w:t xml:space="preserve"> </w:t>
-      </w:r>
-      <w:proofErr w:type="spellStart"/>
-      <w:r>
-        <w:rPr>
-          <w:rFonts w:ascii="Arial" w:hAnsi="Arial" w:cs="Arial"/>
-          <w:sz w:val="20"/>
-          <w:szCs w:val="20"/>
-        </w:rPr>
-        <w:t>saat</w:t>
-      </w:r>
-      <w:proofErr w:type="spellEnd"/>
-      <w:r>
-        <w:rPr>
-          <w:rFonts w:ascii="Arial" w:hAnsi="Arial" w:cs="Arial"/>
-          <w:sz w:val="20"/>
-          <w:szCs w:val="20"/>
-        </w:rPr>
-        <w:t xml:space="preserve"> </w:t>
-      </w:r>
-      <w:proofErr w:type="spellStart"/>
-      <w:r>
-        <w:rPr>
-          <w:rFonts w:ascii="Arial" w:hAnsi="Arial" w:cs="Arial"/>
-          <w:sz w:val="20"/>
-          <w:szCs w:val="20"/>
-        </w:rPr>
-        <w:t>ini</w:t>
-      </w:r>
-      <w:proofErr w:type="spellEnd"/>
-      <w:r>
-        <w:rPr>
-          <w:rFonts w:ascii="Arial" w:hAnsi="Arial" w:cs="Arial"/>
-          <w:sz w:val="20"/>
-          <w:szCs w:val="20"/>
-        </w:rPr>
-        <w:t xml:space="preserve"> (</w:t>
+        <w:t xml:space="preserve"> tanah saat ini (</w:t>
       </w:r>
       <w:r>
         <w:rPr>
@@ -2601,18 +1733,17 @@
           <w:sz w:val="20"/>
           <w:szCs w:val="20"/>
         </w:rPr>
-        <w:t xml:space="preserve">) </w:t>
-      </w:r>
-      <w:proofErr w:type="spellStart"/>
-      <w:r>
-        <w:rPr>
-          <w:rFonts w:ascii="Arial" w:hAnsi="Arial" w:cs="Arial"/>
-          <w:sz w:val="20"/>
-          <w:szCs w:val="20"/>
-        </w:rPr>
-        <w:t>sesuai</w:t>
-      </w:r>
-      <w:proofErr w:type="spellEnd"/>
+        <w:t xml:space="preserve">) sesuai hasil tinjauan kami di lapangan adalah </w:t>
+      </w:r>
+      <w:r>
+        <w:rPr>
+          <w:rFonts w:ascii="Arial" w:hAnsi="Arial" w:cs="Arial"/>
+          <w:noProof/>
+          <w:sz w:val="20"/>
+          <w:szCs w:val="20"/>
+        </w:rPr>
+        <w:t>{{rencana_penggunaan}}</w:t>
+      </w:r>
       <w:r>
         <w:rPr>
           <w:rFonts w:ascii="Arial" w:hAnsi="Arial" w:cs="Arial"/>
@@ -2621,16 +1752,14 @@
         </w:rPr>
         <w:t xml:space="preserve"> </w:t>
       </w:r>
-      <w:proofErr w:type="spellStart"/>
-      <w:r>
-        <w:rPr>
-          <w:rFonts w:ascii="Arial" w:hAnsi="Arial" w:cs="Arial"/>
-          <w:sz w:val="20"/>
-          <w:szCs w:val="20"/>
-        </w:rPr>
-        <w:t>hasil</w:t>
-      </w:r>
-      <w:proofErr w:type="spellEnd"/>
+      <w:r>
+        <w:rPr>
+          <w:rFonts w:ascii="Arial" w:hAnsi="Arial" w:cs="Arial"/>
+          <w:sz w:val="20"/>
+          <w:szCs w:val="20"/>
+        </w:rPr>
+        <w:t>yang digunakan untuk</w:t>
+      </w:r>
       <w:r>
         <w:rPr>
           <w:rFonts w:ascii="Arial" w:hAnsi="Arial" w:cs="Arial"/>
@@ -2639,60 +1768,6 @@
         </w:rPr>
         <w:t xml:space="preserve"> </w:t>
       </w:r>
-      <w:proofErr w:type="spellStart"/>
-      <w:r>
-        <w:rPr>
-          <w:rFonts w:ascii="Arial" w:hAnsi="Arial" w:cs="Arial"/>
-          <w:sz w:val="20"/>
-          <w:szCs w:val="20"/>
-        </w:rPr>
-        <w:t>tinjauan</w:t>
-      </w:r>
-      <w:proofErr w:type="spellEnd"/>
-      <w:r>
-        <w:rPr>
-          <w:rFonts w:ascii="Arial" w:hAnsi="Arial" w:cs="Arial"/>
-          <w:sz w:val="20"/>
-          <w:szCs w:val="20"/>
-        </w:rPr>
-        <w:t xml:space="preserve"> kami di </w:t>
-      </w:r>
-      <w:proofErr w:type="spellStart"/>
-      <w:r>
-        <w:rPr>
-          <w:rFonts w:ascii="Arial" w:hAnsi="Arial" w:cs="Arial"/>
-          <w:sz w:val="20"/>
-          <w:szCs w:val="20"/>
-        </w:rPr>
-        <w:t>lapangan</w:t>
-      </w:r>
-      <w:proofErr w:type="spellEnd"/>
-      <w:r>
-        <w:rPr>
-          <w:rFonts w:ascii="Arial" w:hAnsi="Arial" w:cs="Arial"/>
-          <w:sz w:val="20"/>
-          <w:szCs w:val="20"/>
-        </w:rPr>
-        <w:t xml:space="preserve"> </w:t>
-      </w:r>
-      <w:proofErr w:type="spellStart"/>
-      <w:r>
-        <w:rPr>
-          <w:rFonts w:ascii="Arial" w:hAnsi="Arial" w:cs="Arial"/>
-          <w:sz w:val="20"/>
-          <w:szCs w:val="20"/>
-        </w:rPr>
-        <w:t>adalah</w:t>
-      </w:r>
-      <w:proofErr w:type="spellEnd"/>
-      <w:r>
-        <w:rPr>
-          <w:rFonts w:ascii="Arial" w:hAnsi="Arial" w:cs="Arial"/>
-          <w:sz w:val="20"/>
-          <w:szCs w:val="20"/>
-        </w:rPr>
-        <w:t xml:space="preserve"> </w:t>
-      </w:r>
       <w:r>
         <w:rPr>
           <w:rFonts w:ascii="Arial" w:hAnsi="Arial" w:cs="Arial"/>
@@ -2701,67 +1776,6 @@
           <w:szCs w:val="20"/>
         </w:rPr>
         <w:t>{{penggunaan_sekarang}}</w:t>
-      </w:r>
-      <w:r>
-        <w:rPr>
-          <w:rFonts w:ascii="Arial" w:hAnsi="Arial" w:cs="Arial"/>
-          <w:sz w:val="20"/>
-          <w:szCs w:val="20"/>
-        </w:rPr>
-        <w:t xml:space="preserve"> </w:t>
-      </w:r>
-      <w:r>
-        <w:rPr>
-          <w:rFonts w:ascii="Arial" w:hAnsi="Arial" w:cs="Arial"/>
-          <w:sz w:val="20"/>
-          <w:szCs w:val="20"/>
-        </w:rPr>
-        <w:t xml:space="preserve">yang </w:t>
-      </w:r>
-      <w:proofErr w:type="spellStart"/>
-      <w:r>
-        <w:rPr>
-          <w:rFonts w:ascii="Arial" w:hAnsi="Arial" w:cs="Arial"/>
-          <w:sz w:val="20"/>
-          <w:szCs w:val="20"/>
-        </w:rPr>
-        <w:t>digunakan</w:t>
-      </w:r>
-      <w:proofErr w:type="spellEnd"/>
-      <w:r>
-        <w:rPr>
-          <w:rFonts w:ascii="Arial" w:hAnsi="Arial" w:cs="Arial"/>
-          <w:sz w:val="20"/>
-          <w:szCs w:val="20"/>
-        </w:rPr>
-        <w:t xml:space="preserve"> </w:t>
-      </w:r>
-      <w:proofErr w:type="spellStart"/>
-      <w:r>
-        <w:rPr>
-          <w:rFonts w:ascii="Arial" w:hAnsi="Arial" w:cs="Arial"/>
-          <w:sz w:val="20"/>
-          <w:szCs w:val="20"/>
-        </w:rPr>
-        <w:t>untuk</w:t>
-      </w:r>
-      <w:proofErr w:type="spellEnd"/>
-      <w:r>
-        <w:rPr>
-          <w:rFonts w:ascii="Arial" w:hAnsi="Arial" w:cs="Arial"/>
-          <w:sz w:val="20"/>
-          <w:szCs w:val="20"/>
-        </w:rPr>
-        <w:t xml:space="preserve"> </w:t>
-      </w:r>
-      <w:r>
-        <w:rPr>
-          <w:rFonts w:ascii="Arial" w:hAnsi="Arial" w:cs="Arial"/>
-          <w:noProof/>
-          <w:sz w:val="20"/>
-          <w:szCs w:val="20"/>
-        </w:rPr>
-        <w:t>{{rencana_penggunaan}}</w:t>
       </w:r>
       <w:r>
         <w:rPr>
@@ -2935,7 +1949,6 @@
           <w:szCs w:val="20"/>
           <w:lang w:val="sv-SE"/>
         </w:rPr>
-        <w:lastRenderedPageBreak/>
         <w:t>Timur</w:t>
       </w:r>
       <w:r>
@@ -3098,6 +2111,7 @@
           <w:szCs w:val="20"/>
           <w:lang w:val="sv-SE"/>
         </w:rPr>
+        <w:lastRenderedPageBreak/>
         <w:t>Barat</w:t>
       </w:r>
       <w:r>
@@ -3223,47 +2237,7 @@
           <w:sz w:val="20"/>
           <w:szCs w:val="20"/>
         </w:rPr>
-        <w:t xml:space="preserve">Lampiran </w:t>
-      </w:r>
-      <w:proofErr w:type="spellStart"/>
-      <w:r>
-        <w:rPr>
-          <w:rFonts w:ascii="Arial" w:hAnsi="Arial" w:cs="Arial"/>
-          <w:color w:val="000000"/>
-          <w:sz w:val="20"/>
-          <w:szCs w:val="20"/>
-        </w:rPr>
-        <w:t>Dokumentasi</w:t>
-      </w:r>
-      <w:proofErr w:type="spellEnd"/>
-      <w:r>
-        <w:rPr>
-          <w:rFonts w:ascii="Arial" w:hAnsi="Arial" w:cs="Arial"/>
-          <w:color w:val="000000"/>
-          <w:sz w:val="20"/>
-          <w:szCs w:val="20"/>
-        </w:rPr>
-        <w:t xml:space="preserve"> </w:t>
-      </w:r>
-      <w:proofErr w:type="spellStart"/>
-      <w:r>
-        <w:rPr>
-          <w:rFonts w:ascii="Arial" w:hAnsi="Arial" w:cs="Arial"/>
-          <w:color w:val="000000"/>
-          <w:sz w:val="20"/>
-          <w:szCs w:val="20"/>
-        </w:rPr>
-        <w:t>Pemeriksaan</w:t>
-      </w:r>
-      <w:proofErr w:type="spellEnd"/>
-      <w:r>
-        <w:rPr>
-          <w:rFonts w:ascii="Arial" w:hAnsi="Arial" w:cs="Arial"/>
-          <w:color w:val="000000"/>
-          <w:sz w:val="20"/>
-          <w:szCs w:val="20"/>
-        </w:rPr>
-        <w:t xml:space="preserve"> Lapang;</w:t>
+        <w:t>Lampiran Dokumentasi Pemeriksaan Lapang;</w:t>
       </w:r>
       <w:bookmarkEnd w:id="2"/>
     </w:p>

</xml_diff>